<commit_message>
Segunda ronda: unificar criterios de bloqueo, explicar planitud de malla, corregir tope de saturación e informe
</commit_message>
<xml_diff>
--- a/informe_tecnico.docx
+++ b/informe_tecnico.docx
@@ -1539,6 +1539,67 @@
     </w:p>
     <w:p>
       <w:pPr>
+        <w:spacing w:after="80" w:before="120"/>
+        <w:jc w:val="center"/>
+      </w:pPr>
+      <w:r>
+        <w:drawing>
+          <wp:inline distT="0" distB="0" distL="0" distR="0">
+            <wp:extent cx="4953000" cy="3314700"/>
+            <wp:effectExtent t="0" r="0" b="0" l="0"/>
+            <wp:docPr id="1" name="Captura: corte transversal del simulador con los dos criterios de bloqueo" descr="Captura: corte transversal del simulador con los dos criterios de bloqueo" title="Captura: corte transversal del simulador con los dos criterios de bloqueo"/>
+            <wp:cNvGraphicFramePr>
+              <a:graphicFrameLocks xmlns:a="http://schemas.openxmlformats.org/drawingml/2006/main" noChangeAspect="1"/>
+            </wp:cNvGraphicFramePr>
+            <a:graphic xmlns:a="http://schemas.openxmlformats.org/drawingml/2006/main">
+              <a:graphicData uri="http://schemas.openxmlformats.org/drawingml/2006/picture">
+                <pic:pic xmlns:pic="http://schemas.openxmlformats.org/drawingml/2006/picture">
+                  <pic:nvPicPr>
+                    <pic:cNvPr id="0" name="" descr=""/>
+                    <pic:cNvPicPr>
+                      <a:picLocks noChangeAspect="1" noChangeArrowheads="1"/>
+                    </pic:cNvPicPr>
+                  </pic:nvPicPr>
+                  <pic:blipFill>
+                    <a:blip r:embed="rId7" cstate="none"/>
+                    <a:srcRect/>
+                    <a:stretch>
+                      <a:fillRect/>
+                    </a:stretch>
+                  </pic:blipFill>
+                  <pic:spPr bwMode="auto">
+                    <a:xfrm>
+                      <a:off x="0" y="0"/>
+                      <a:ext cx="4953000" cy="3314700"/>
+                    </a:xfrm>
+                    <a:prstGeom prst="rect">
+                      <a:avLst/>
+                    </a:prstGeom>
+                  </pic:spPr>
+                </pic:pic>
+              </a:graphicData>
+            </a:graphic>
+          </wp:inline>
+        </w:drawing>
+      </w:r>
+    </w:p>
+    <w:p>
+      <w:pPr>
+        <w:spacing w:after="200"/>
+      </w:pPr>
+      <w:r>
+        <w:rPr>
+          <w:i/>
+          <w:iCs/>
+          <w:color w:val="5B6472"/>
+          <w:sz w:val="18"/>
+          <w:szCs w:val="18"/>
+        </w:rPr>
+        <w:t xml:space="preserve">Figura 1. Corte transversal del simulador para el escenario de esta sección (concreto, 1900 MHz), con los dos criterios de bloqueo (sensibilidad y SNR) mostrados en paralelo.</w:t>
+      </w:r>
+    </w:p>
+    <w:p>
+      <w:pPr>
         <w:pStyle w:val="Heading2"/>
         <w:spacing w:after="120" w:before="220"/>
       </w:pPr>
@@ -1550,7 +1611,7 @@
           <w:sz w:val="24"/>
           <w:szCs w:val="24"/>
         </w:rPr>
-        <w:t xml:space="preserve">2.2 Piso de ruido y relación señal-ruido (SNR)</w:t>
+        <w:t xml:space="preserve">2.2 Piso de ruido, SNR, y los dos criterios de bloqueo</w:t>
       </w:r>
     </w:p>
     <w:p>
@@ -1647,6 +1708,137 @@
           <w:szCs w:val="18"/>
         </w:rPr>
         <w:t xml:space="preserve">BW: ancho de banda del canal por tecnología (2G 200 kHz, 3G 5 MHz, 4G 20 MHz, 5G Sub-6 100 MHz, 5G mmWave 400 MHz). NF: figura de ruido del receptor, 7 dB. SNR = Potencia recibida − Piso de ruido.</w:t>
+      </w:r>
+    </w:p>
+    <w:p>
+      <w:pPr>
+        <w:spacing w:after="160" w:line="276"/>
+      </w:pPr>
+      <w:r>
+        <w:rPr>
+          <w:b w:val="false"/>
+          <w:bCs w:val="false"/>
+          <w:i w:val="false"/>
+          <w:iCs w:val="false"/>
+          <w:color w:val="1A1F27"/>
+          <w:sz w:val="22"/>
+          <w:szCs w:val="22"/>
+        </w:rPr>
+        <w:t xml:space="preserve">El umbral de −95 dBm usado en la guía del curso es un umbral de sensibilidad de receptor, no un criterio de SNR: es el nivel de potencia absoluta mínimo con el que un receptor comercial típico logra enganchar, y ya incorpora de fábrica una SNR mínima razonable para condiciones normales de ancho de banda. No es, sin embargo, matemáticamente equivalente a exigir una SNR mínima explícita, y ambos criterios pueden discrepar en banda angosta. Por eso el simulador corregido muestra los dos criterios en paralelo:</w:t>
+      </w:r>
+    </w:p>
+    <w:p>
+      <w:pPr>
+        <w:pStyle w:val="ListParagraph"/>
+        <w:numPr>
+          <w:ilvl w:val="0"/>
+          <w:numId w:val="1"/>
+        </w:numPr>
+        <w:spacing w:after="120" w:line="276"/>
+      </w:pPr>
+      <w:r>
+        <w:rPr>
+          <w:color w:val="1A1F27"/>
+          <w:sz w:val="22"/>
+          <w:szCs w:val="22"/>
+        </w:rPr>
+        <w:t xml:space="preserve">Criterio 1 — sensibilidad: Rx &lt; −95 dBm.</w:t>
+      </w:r>
+    </w:p>
+    <w:p>
+      <w:pPr>
+        <w:pStyle w:val="ListParagraph"/>
+        <w:numPr>
+          <w:ilvl w:val="0"/>
+          <w:numId w:val="1"/>
+        </w:numPr>
+        <w:spacing w:after="120" w:line="276"/>
+      </w:pPr>
+      <w:r>
+        <w:rPr>
+          <w:color w:val="1A1F27"/>
+          <w:sz w:val="22"/>
+          <w:szCs w:val="22"/>
+        </w:rPr>
+        <w:t xml:space="preserve">Criterio 2 — SNR mínima de enganche por tecnología: SNR &lt; SNR_mín, con SNR_mín = 9 dB (2G), 5 dB (3G), 2 dB (4G), 0 dB (5G Sub-6 y mmWave). Este valor también reemplaza a 0 dB como pivote de color de la SNR en la interfaz, que antes era un punto de corte arbitrario.</w:t>
+      </w:r>
+    </w:p>
+    <w:p>
+      <w:pPr>
+        <w:spacing w:after="160" w:line="276"/>
+      </w:pPr>
+      <w:r>
+        <w:rPr>
+          <w:b w:val="false"/>
+          <w:bCs w:val="false"/>
+          <w:i w:val="false"/>
+          <w:iCs w:val="false"/>
+          <w:color w:val="1A1F27"/>
+          <w:sz w:val="22"/>
+          <w:szCs w:val="22"/>
+        </w:rPr>
+        <w:t xml:space="preserve">La discrepancia aparece porque un ancho de banda pequeño implica un piso de ruido muy bajo (BW pequeño → −10·log10(BW) grande → piso de ruido muy negativo), de modo que la SNR puede seguir siendo alta incluso cuando la potencia absoluta ya cayó por debajo de −95 dBm. El caso más claro es 2G bajo malla de acero (150 m, 8 m, a = 5 mm): Rx = −100.5 dBm (bloqueado por el criterio 1) pero SNR = +13.5 dB, muy por encima del mínimo de 9 dB de 2G (criterio 2 no bloquea). El simulador declara explícitamente esta discrepancia en la interfaz en vez de reportar solo el criterio 1 — ver figura 2.</w:t>
+      </w:r>
+    </w:p>
+    <w:p>
+      <w:pPr>
+        <w:spacing w:after="80" w:before="120"/>
+        <w:jc w:val="center"/>
+      </w:pPr>
+      <w:r>
+        <w:drawing>
+          <wp:inline distT="0" distB="0" distL="0" distR="0">
+            <wp:extent cx="4953000" cy="3676650"/>
+            <wp:effectExtent t="0" r="0" b="0" l="0"/>
+            <wp:docPr id="1" name="Captura: criterios de bloqueo en desacuerdo (2G, malla de acero)" descr="Captura: criterios de bloqueo en desacuerdo (2G, malla de acero)" title="Captura: criterios de bloqueo en desacuerdo (2G, malla de acero)"/>
+            <wp:cNvGraphicFramePr>
+              <a:graphicFrameLocks xmlns:a="http://schemas.openxmlformats.org/drawingml/2006/main" noChangeAspect="1"/>
+            </wp:cNvGraphicFramePr>
+            <a:graphic xmlns:a="http://schemas.openxmlformats.org/drawingml/2006/main">
+              <a:graphicData uri="http://schemas.openxmlformats.org/drawingml/2006/picture">
+                <pic:pic xmlns:pic="http://schemas.openxmlformats.org/drawingml/2006/picture">
+                  <pic:nvPicPr>
+                    <pic:cNvPr id="0" name="" descr=""/>
+                    <pic:cNvPicPr>
+                      <a:picLocks noChangeAspect="1" noChangeArrowheads="1"/>
+                    </pic:cNvPicPr>
+                  </pic:nvPicPr>
+                  <pic:blipFill>
+                    <a:blip r:embed="rId8" cstate="none"/>
+                    <a:srcRect/>
+                    <a:stretch>
+                      <a:fillRect/>
+                    </a:stretch>
+                  </pic:blipFill>
+                  <pic:spPr bwMode="auto">
+                    <a:xfrm>
+                      <a:off x="0" y="0"/>
+                      <a:ext cx="4953000" cy="3676650"/>
+                    </a:xfrm>
+                    <a:prstGeom prst="rect">
+                      <a:avLst/>
+                    </a:prstGeom>
+                  </pic:spPr>
+                </pic:pic>
+              </a:graphicData>
+            </a:graphic>
+          </wp:inline>
+        </w:drawing>
+      </w:r>
+    </w:p>
+    <w:p>
+      <w:pPr>
+        <w:spacing w:after="200"/>
+      </w:pPr>
+      <w:r>
+        <w:rPr>
+          <w:i/>
+          <w:iCs/>
+          <w:color w:val="5B6472"/>
+          <w:sz w:val="18"/>
+          <w:szCs w:val="18"/>
+        </w:rPr>
+        <w:t xml:space="preserve">Figura 2. Malla de acero a 850 MHz: bloqueado por el umbral de sensibilidad pero con SNR aún favorable. La interfaz declara la discrepancia en lugar de ocultarla.</w:t>
       </w:r>
     </w:p>
     <w:p>
@@ -2909,7 +3101,24 @@
           <w:sz w:val="18"/>
           <w:szCs w:val="18"/>
         </w:rPr>
-        <w:t xml:space="preserve">* 850 MHz queda fuera del rango de validación de la norma (desde 1 GHz); se muestra como extrapolación del modelo, con advertencia visible en la interfaz del simulador. ** El coeficiente pleno de concreto a 28 GHz (447 dB/m) excede el tope de saturación de 200 dB que aplica el simulador (representa el punto donde el ruido térmico del receptor domina sobre cualquier absorción adicional); el ladrillo tiene un tope análogo de 160 dB, que en la práctica solo se alcanza con espesores poco realistas.</w:t>
+        <w:t xml:space="preserve">* 850 MHz queda fuera del rango de validación de la norma (desde 1 GHz); se muestra como extrapolación del modelo, con advertencia visible en la interfaz del simulador. ** 447 dB/m es el coeficiente de atenuación POR METRO de concreto a 28 GHz — no debe confundirse con el tope de saturación de 200 dB, que es una atenuación TOTAL (no por metro). Ambas magnitudes tienen unidades distintas: a ese coeficiente, el concreto alcanza los 200 dB de tope desde apenas ~0.45 m de espesor; a 850 MHz (≈29 dB/m) necesitaría ~6.9 m para llegar al mismo tope. El ladrillo (tope 160 dB) lo alcanza desde ~4.8 m a 28 GHz y ~8.3 m a 850 MHz. En ambos casos, el tope no es un límite físico de la absorción del material —ver explicación en la sección 3.1— sino el piso práctico impuesto por trayectorias de flanqueo (puertas, ventanas, ductos, juntas, difracción sobre el muro).</w:t>
+      </w:r>
+    </w:p>
+    <w:p>
+      <w:pPr>
+        <w:spacing w:after="160" w:line="276"/>
+      </w:pPr>
+      <w:r>
+        <w:rPr>
+          <w:b w:val="false"/>
+          <w:bCs w:val="false"/>
+          <w:i w:val="false"/>
+          <w:iCs w:val="false"/>
+          <w:color w:val="1A1F27"/>
+          <w:sz w:val="22"/>
+          <w:szCs w:val="22"/>
+        </w:rPr>
+        <w:t xml:space="preserve">Nota sobre el tope de saturación: en una versión anterior de este informe se atribuía el tope a que "el ruido térmico del receptor domina sobre cualquier absorción adicional". Esa explicación es incorrecta: el ruido térmico del receptor no limita cuánto atenúa un muro, solo define el piso de ruido con el que se compara la señal recibida (ver sección 2.2). La explicación correcta es que, más allá de cierto espesor, la trayectoria directa a través del material ya está tan atenuada que deja de ser la ruta dominante de fuga: pasan a dominar las trayectorias de flanqueo —puertas, ventanas, ductos de ventilación, juntas constructivas, y difracción de la señal por encima o alrededor del muro—, que ningún aumento de espesor del material puede reducir. Por eso el tope se modela como una atenuación total fija (dB), no como un límite del coeficiente por metro (dB/m).</w:t>
       </w:r>
     </w:p>
     <w:p>
@@ -3037,7 +3246,152 @@
           <w:sz w:val="24"/>
           <w:szCs w:val="24"/>
         </w:rPr>
-        <w:t xml:space="preserve">3.2 Comparativa de materiales para la defensa: 1900 MHz vs. 3.5 GHz</w:t>
+        <w:t xml:space="preserve">3.2 Por qué la malla da (casi) la misma potencia recibida en las 5 bandas</w:t>
+      </w:r>
+    </w:p>
+    <w:p>
+      <w:pPr>
+        <w:spacing w:after="160" w:line="276"/>
+      </w:pPr>
+      <w:r>
+        <w:rPr>
+          <w:b w:val="false"/>
+          <w:bCs w:val="false"/>
+          <w:i w:val="false"/>
+          <w:iCs w:val="false"/>
+          <w:color w:val="1A1F27"/>
+          <w:sz w:val="22"/>
+          <w:szCs w:val="22"/>
+        </w:rPr>
+        <w:t xml:space="preserve">Con malla de acero, las 5 bandas celulares dan una potencia recibida prácticamente idéntica para una misma abertura — por ejemplo, −100.5 dBm con a = 5 mm, antena externa a 150 m y punto de medición a 8 m de profundidad. Esto no es un error del simulador ni de la gráfica comparativa: es consecuencia directa del álgebra del modelo.</w:t>
+      </w:r>
+    </w:p>
+    <w:p>
+      <w:pPr>
+        <w:spacing w:after="160" w:line="276"/>
+      </w:pPr>
+      <w:r>
+        <w:rPr>
+          <w:b w:val="false"/>
+          <w:bCs w:val="false"/>
+          <w:i w:val="false"/>
+          <w:iCs w:val="false"/>
+          <w:color w:val="1A1F27"/>
+          <w:sz w:val="22"/>
+          <w:szCs w:val="22"/>
+        </w:rPr>
+        <w:t xml:space="preserve">En SE(dB) = max(0, 20·log10(λ/2a)) + 27.3·(t/a), con λ = c/f, el primer término puede reescribirse como 20·log10(c) − 20·log10(f). Ese −20·log10(f) cancela exactamente el +20·log10(f) que aporta el FSPL en el balance de potencias, siempre que λ/(2a) &gt; 1 (régimen de guía de onda bajo corte). El resultado algebraico es que la potencia recibida queda independiente de la frecuencia mientras la malla opere en ese régimen — no depende de qué tan atenuadora sea la malla en términos absolutos, sino de que el término de frecuencia se cancele en ambos lados del balance.</w:t>
+      </w:r>
+    </w:p>
+    <w:p>
+      <w:pPr>
+        <w:spacing w:after="80" w:before="120"/>
+        <w:jc w:val="center"/>
+      </w:pPr>
+      <w:r>
+        <w:drawing>
+          <wp:inline distT="0" distB="0" distL="0" distR="0">
+            <wp:extent cx="4953000" cy="2447925"/>
+            <wp:effectExtent t="0" r="0" b="0" l="0"/>
+            <wp:docPr id="1" name="Captura: las 5 bandas dan la misma potencia recibida con malla de acero" descr="Captura: las 5 bandas dan la misma potencia recibida con malla de acero" title="Captura: las 5 bandas dan la misma potencia recibida con malla de acero"/>
+            <wp:cNvGraphicFramePr>
+              <a:graphicFrameLocks xmlns:a="http://schemas.openxmlformats.org/drawingml/2006/main" noChangeAspect="1"/>
+            </wp:cNvGraphicFramePr>
+            <a:graphic xmlns:a="http://schemas.openxmlformats.org/drawingml/2006/main">
+              <a:graphicData uri="http://schemas.openxmlformats.org/drawingml/2006/picture">
+                <pic:pic xmlns:pic="http://schemas.openxmlformats.org/drawingml/2006/picture">
+                  <pic:nvPicPr>
+                    <pic:cNvPr id="0" name="" descr=""/>
+                    <pic:cNvPicPr>
+                      <a:picLocks noChangeAspect="1" noChangeArrowheads="1"/>
+                    </pic:cNvPicPr>
+                  </pic:nvPicPr>
+                  <pic:blipFill>
+                    <a:blip r:embed="rId9" cstate="none"/>
+                    <a:srcRect/>
+                    <a:stretch>
+                      <a:fillRect/>
+                    </a:stretch>
+                  </pic:blipFill>
+                  <pic:spPr bwMode="auto">
+                    <a:xfrm>
+                      <a:off x="0" y="0"/>
+                      <a:ext cx="4953000" cy="2447925"/>
+                    </a:xfrm>
+                    <a:prstGeom prst="rect">
+                      <a:avLst/>
+                    </a:prstGeom>
+                  </pic:spPr>
+                </pic:pic>
+              </a:graphicData>
+            </a:graphic>
+          </wp:inline>
+        </w:drawing>
+      </w:r>
+    </w:p>
+    <w:p>
+      <w:pPr>
+        <w:spacing w:after="200"/>
+      </w:pPr>
+      <w:r>
+        <w:rPr>
+          <w:i/>
+          <w:iCs/>
+          <w:color w:val="5B6472"/>
+          <w:sz w:val="18"/>
+          <w:szCs w:val="18"/>
+        </w:rPr>
+        <w:t xml:space="preserve">Figura 3. Las 5 bandas caen en la misma potencia recibida (≈ −101 dBm) con malla de acero, a = 5 mm. La nota bajo la gráfica se muestra automáticamente en la interfaz solo cuando el material seleccionado es malla.</w:t>
+      </w:r>
+    </w:p>
+    <w:p>
+      <w:pPr>
+        <w:spacing w:after="160" w:line="276"/>
+      </w:pPr>
+      <w:r>
+        <w:rPr>
+          <w:b w:val="false"/>
+          <w:bCs w:val="false"/>
+          <w:i w:val="false"/>
+          <w:iCs w:val="false"/>
+          <w:color w:val="1A1F27"/>
+          <w:sz w:val="22"/>
+          <w:szCs w:val="22"/>
+        </w:rPr>
+        <w:t xml:space="preserve">Lejos de ser una debilidad del modelo, esta planitud es un argumento de defensa a favor de la malla como material de blindaje: a diferencia del concreto o el ladrillo —cuyo coeficiente de atenuación en dB/m crece marcadamente con la frecuencia, como muestra la tabla de la sección 3—, la malla ofrece un nivel de protección parejo en toda la banda celular de interés, sin necesidad de sobredimensionar el diseño para la banda más alta.</w:t>
+      </w:r>
+    </w:p>
+    <w:p>
+      <w:pPr>
+        <w:spacing w:after="160" w:line="276"/>
+      </w:pPr>
+      <w:r>
+        <w:rPr>
+          <w:b w:val="false"/>
+          <w:bCs w:val="false"/>
+          <w:i w:val="false"/>
+          <w:iCs w:val="false"/>
+          <w:color w:val="1A1F27"/>
+          <w:sz w:val="22"/>
+          <w:szCs w:val="22"/>
+        </w:rPr>
+        <w:t xml:space="preserve">La excepción a esta planitud ocurre cuando la abertura ya es mayor o igual a λ/2 de la banda más alta considerada (28 GHz: λ/2 ≈ 5.36 mm). En ese punto, el término 20·log10(λ/2a) se anula para esa banda —la malla deja de operar en régimen de guía de onda bajo corte para ella— y esa banda se despega del resto del grupo, mostrando una potencia recibida distinta (mayor fuga) mientras las demás bandas permanecen agrupadas entre sí.</w:t>
+      </w:r>
+    </w:p>
+    <w:p>
+      <w:pPr>
+        <w:pStyle w:val="Heading2"/>
+        <w:spacing w:after="120" w:before="220"/>
+      </w:pPr>
+      <w:r>
+        <w:rPr>
+          <w:b/>
+          <w:bCs/>
+          <w:color w:val="0B0F14"/>
+          <w:sz w:val="24"/>
+          <w:szCs w:val="24"/>
+        </w:rPr>
+        <w:t xml:space="preserve">3.3 Comparativa de materiales para la defensa: 1900 MHz vs. 3.5 GHz</w:t>
       </w:r>
     </w:p>
     <w:p>
@@ -3294,7 +3648,7 @@
                 <w:sz w:val="18"/>
                 <w:szCs w:val="18"/>
               </w:rPr>
-              <w:t xml:space="preserve">1.00 m</w:t>
+              <w:t xml:space="preserve">1.00 m (límite superior del rango simulado)</w:t>
             </w:r>
           </w:p>
         </w:tc>
@@ -3374,6 +3728,21 @@
         </w:tc>
       </w:tr>
     </w:tbl>
+    <w:p>
+      <w:pPr>
+        <w:spacing w:after="200"/>
+      </w:pPr>
+      <w:r>
+        <w:rPr>
+          <w:i/>
+          <w:iCs/>
+          <w:color w:val="5B6472"/>
+          <w:sz w:val="18"/>
+          <w:szCs w:val="18"/>
+        </w:rPr>
+        <w:t xml:space="preserve">El valor de ladrillo a 3.5 GHz (≈ 1.00 m) cae justo en el tope del control deslizante de espesor del simulador (máximo 1.00 m); la interfaz corregida lo señala como límite del rango simulado en vez de presentarlo como un valor exacto sin más contexto.</w:t>
+      </w:r>
+    </w:p>
     <w:p>
       <w:pPr>
         <w:spacing w:after="160" w:line="276"/>
@@ -3499,21 +3868,6 @@
     </w:p>
     <w:p>
       <w:pPr>
-        <w:spacing w:after="200"/>
-      </w:pPr>
-      <w:r>
-        <w:rPr>
-          <w:i/>
-          <w:iCs/>
-          <w:color w:val="5B6472"/>
-          <w:sz w:val="18"/>
-          <w:szCs w:val="18"/>
-        </w:rPr>
-        <w:t xml:space="preserve">[Insertar aquí 2–3 capturas de pantalla: (1) corte transversal con los indicadores numéricos, (2) plano en planta con el mapa de calor, (3) tabla comparativa de materiales de la interfaz.]</w:t>
-      </w:r>
-    </w:p>
-    <w:p>
-      <w:pPr>
         <w:spacing w:after="160" w:line="276"/>
       </w:pPr>
       <w:r>
@@ -3526,6 +3880,145 @@
           <w:sz w:val="22"/>
           <w:szCs w:val="22"/>
         </w:rPr>
+        <w:t xml:space="preserve">El patio/área común dentro del perímetro (sin muro de bloqueo) se modela con un exponente de propagación n=2 y una profundidad efectiva de distIntM/2, en lugar del n=3 y la profundidad completa usados dentro de los pabellones. Estos son supuestos de trazado para ilustrar el contraste visual entre el patio (más expuesto, línea de vista parcial) y el interior de un pabellón (más protegido, múltiples reflexiones) — no mediciones de campo ni un modelo de propagación validado para espacios abiertos.</w:t>
+      </w:r>
+    </w:p>
+    <w:p>
+      <w:pPr>
+        <w:spacing w:after="80" w:before="120"/>
+        <w:jc w:val="center"/>
+      </w:pPr>
+      <w:r>
+        <w:drawing>
+          <wp:inline distT="0" distB="0" distL="0" distR="0">
+            <wp:extent cx="4953000" cy="3371850"/>
+            <wp:effectExtent t="0" r="0" b="0" l="0"/>
+            <wp:docPr id="1" name="Captura: plano en planta con mapa de calor" descr="Captura: plano en planta con mapa de calor" title="Captura: plano en planta con mapa de calor"/>
+            <wp:cNvGraphicFramePr>
+              <a:graphicFrameLocks xmlns:a="http://schemas.openxmlformats.org/drawingml/2006/main" noChangeAspect="1"/>
+            </wp:cNvGraphicFramePr>
+            <a:graphic xmlns:a="http://schemas.openxmlformats.org/drawingml/2006/main">
+              <a:graphicData uri="http://schemas.openxmlformats.org/drawingml/2006/picture">
+                <pic:pic xmlns:pic="http://schemas.openxmlformats.org/drawingml/2006/picture">
+                  <pic:nvPicPr>
+                    <pic:cNvPr id="0" name="" descr=""/>
+                    <pic:cNvPicPr>
+                      <a:picLocks noChangeAspect="1" noChangeArrowheads="1"/>
+                    </pic:cNvPicPr>
+                  </pic:nvPicPr>
+                  <pic:blipFill>
+                    <a:blip r:embed="rId10" cstate="none"/>
+                    <a:srcRect/>
+                    <a:stretch>
+                      <a:fillRect/>
+                    </a:stretch>
+                  </pic:blipFill>
+                  <pic:spPr bwMode="auto">
+                    <a:xfrm>
+                      <a:off x="0" y="0"/>
+                      <a:ext cx="4953000" cy="3371850"/>
+                    </a:xfrm>
+                    <a:prstGeom prst="rect">
+                      <a:avLst/>
+                    </a:prstGeom>
+                  </pic:spPr>
+                </pic:pic>
+              </a:graphicData>
+            </a:graphic>
+          </wp:inline>
+        </w:drawing>
+      </w:r>
+    </w:p>
+    <w:p>
+      <w:pPr>
+        <w:spacing w:after="200"/>
+      </w:pPr>
+      <w:r>
+        <w:rPr>
+          <w:i/>
+          <w:iCs/>
+          <w:color w:val="5B6472"/>
+          <w:sz w:val="18"/>
+          <w:szCs w:val="18"/>
+        </w:rPr>
+        <w:t xml:space="preserve">Figura 4. Plano en planta del recinto: perímetro, tres pabellones, patio (sin muro) y torre del operador afuera. El color de cada celda indica la potencia recibida estimada.</w:t>
+      </w:r>
+    </w:p>
+    <w:p>
+      <w:pPr>
+        <w:spacing w:after="80" w:before="120"/>
+        <w:jc w:val="center"/>
+      </w:pPr>
+      <w:r>
+        <w:drawing>
+          <wp:inline distT="0" distB="0" distL="0" distR="0">
+            <wp:extent cx="4953000" cy="1695450"/>
+            <wp:effectExtent t="0" r="0" b="0" l="0"/>
+            <wp:docPr id="1" name="Captura: tabla comparativa de materiales" descr="Captura: tabla comparativa de materiales" title="Captura: tabla comparativa de materiales"/>
+            <wp:cNvGraphicFramePr>
+              <a:graphicFrameLocks xmlns:a="http://schemas.openxmlformats.org/drawingml/2006/main" noChangeAspect="1"/>
+            </wp:cNvGraphicFramePr>
+            <a:graphic xmlns:a="http://schemas.openxmlformats.org/drawingml/2006/main">
+              <a:graphicData uri="http://schemas.openxmlformats.org/drawingml/2006/picture">
+                <pic:pic xmlns:pic="http://schemas.openxmlformats.org/drawingml/2006/picture">
+                  <pic:nvPicPr>
+                    <pic:cNvPr id="0" name="" descr=""/>
+                    <pic:cNvPicPr>
+                      <a:picLocks noChangeAspect="1" noChangeArrowheads="1"/>
+                    </pic:cNvPicPr>
+                  </pic:nvPicPr>
+                  <pic:blipFill>
+                    <a:blip r:embed="rId11" cstate="none"/>
+                    <a:srcRect/>
+                    <a:stretch>
+                      <a:fillRect/>
+                    </a:stretch>
+                  </pic:blipFill>
+                  <pic:spPr bwMode="auto">
+                    <a:xfrm>
+                      <a:off x="0" y="0"/>
+                      <a:ext cx="4953000" cy="1695450"/>
+                    </a:xfrm>
+                    <a:prstGeom prst="rect">
+                      <a:avLst/>
+                    </a:prstGeom>
+                  </pic:spPr>
+                </pic:pic>
+              </a:graphicData>
+            </a:graphic>
+          </wp:inline>
+        </w:drawing>
+      </w:r>
+    </w:p>
+    <w:p>
+      <w:pPr>
+        <w:spacing w:after="200"/>
+      </w:pPr>
+      <w:r>
+        <w:rPr>
+          <w:i/>
+          <w:iCs/>
+          <w:color w:val="5B6472"/>
+          <w:sz w:val="18"/>
+          <w:szCs w:val="18"/>
+        </w:rPr>
+        <w:t xml:space="preserve">Figura 5. Tabla comparativa de materiales de la interfaz, con las notas de rango simulado (límite superior de espesor para ladrillo, y clamps de abertura para malla).</w:t>
+      </w:r>
+    </w:p>
+    <w:p>
+      <w:pPr>
+        <w:spacing w:after="160" w:line="276"/>
+      </w:pPr>
+      <w:r>
+        <w:rPr>
+          <w:b w:val="false"/>
+          <w:bCs w:val="false"/>
+          <w:i w:val="false"/>
+          <w:iCs w:val="false"/>
+          <w:color w:val="1A1F27"/>
+          <w:sz w:val="22"/>
+          <w:szCs w:val="22"/>
+        </w:rPr>
         <w:t xml:space="preserve">Enlaces:</w:t>
       </w:r>
     </w:p>
@@ -3533,7 +4026,7 @@
       <w:pPr>
         <w:spacing w:after="120"/>
       </w:pPr>
-      <w:hyperlink w:history="1" r:id="rIdui6wlwioseagz4nvbzo-n">
+      <w:hyperlink w:history="1" r:id="rIdxtzkrmuqh3tr3zbdk-i9q">
         <w:r>
           <w:rPr>
             <w:rStyle w:val="Hyperlink"/>
@@ -3548,7 +4041,7 @@
       <w:pPr>
         <w:spacing w:after="120"/>
       </w:pPr>
-      <w:hyperlink w:history="1" r:id="rIdc20u6og3jtdrgo5kvzfet">
+      <w:hyperlink w:history="1" r:id="rId4hnzidlmls_if0m_xmrz8">
         <w:r>
           <w:rPr>
             <w:rStyle w:val="Hyperlink"/>

</xml_diff>